<commit_message>
Versión 2 del cuadro de pautas: ninguno de los contratos puede liquidarse; figura de cierre sin liquidación
Co-Authored-By: Claude Opus 5.5 <noreply@anthropic.com>
Claude-Session: https://claude.ai/code/session_01GubghtsGLjP6KP7VAyJTD5
</commit_message>
<xml_diff>
--- a/caso-faro-distrito-riego-la-carrera/Pautas_cierre_contratos_Distrito_Riego_La_Carrera.docx
+++ b/caso-faro-distrito-riego-la-carrera/Pautas_cierre_contratos_Distrito_Riego_La_Carrera.docx
@@ -31,7 +31,7 @@
           <w:sz w:val="17"/>
           <w:szCs w:val="17"/>
         </w:rPr>
-        <w:t xml:space="preserve">CI-SADR-04090-2022 (Departamento Norte de Santander – EICE Faro del Catatumbo S.A.S.) y CD-FC-033-2023 (EICE – contratista). Reunión Jefatura de Gabinete, 22-oct-2026.</w:t>
+        <w:t xml:space="preserve">CI-SADR-04090-2022 (Departamento Norte de Santander – EICE Faro del Catatumbo S.A.S.) y CD-FC-033-2023 (EICE – contratista). Reunión Jefatura de Gabinete, 22-oct-2026. VERSIÓN 2 (corregida tras verificación).</w:t>
       </w:r>
     </w:p>
     <w:tbl>
@@ -118,7 +118,7 @@
                 <w:sz w:val="17"/>
                 <w:szCs w:val="17"/>
               </w:rPr>
-              <w:t xml:space="preserve">Situación</w:t>
+              <w:t xml:space="preserve">Situación (verificada en SECOP)</w:t>
             </w:r>
           </w:p>
         </w:tc>
@@ -221,7 +221,7 @@
                 <w:sz w:val="17"/>
                 <w:szCs w:val="17"/>
               </w:rPr>
-              <w:t xml:space="preserve">1. Interadministrativo CI-SADR-04090-2022 (Depto. – EICE)</w:t>
+              <w:t xml:space="preserve">1. ¿Se puede liquidar?</w:t>
             </w:r>
           </w:p>
         </w:tc>
@@ -253,7 +253,7 @@
                 <w:sz w:val="17"/>
                 <w:szCs w:val="17"/>
               </w:rPr>
-              <w:t xml:space="preserve">Rige Ley 80/1150. Terminó 20-dic-2023 (SECOP II). Bilateral hasta 20-abr-2024; unilateral hasta 20-jun-2024; plazo máximo 20-jun-2026. VENCIDO.</w:t>
+              <w:t xml:space="preserve">NINGUNO de los dos. Interadministrativo: terminó 20-dic-2023 → venció 20-jun-2026. Derivado: cl. 31 del contrato y art. 88 del manual EICE (Acuerdo 008/2022) repiten 4 + 2 meses + 2 años → venció ≈ 27-may-2026.</w:t>
             </w:r>
           </w:p>
         </w:tc>
@@ -285,7 +285,7 @@
                 <w:sz w:val="17"/>
                 <w:szCs w:val="17"/>
               </w:rPr>
-              <w:t xml:space="preserve">Art. 60 Ley 80; art. 11 Ley 1150; art. 164.2.j CPACA; Concepto ANCP-CCE C-1669 de 2025 (se pierde competencia al vencer los 2 años y 6 meses).</w:t>
+              <w:t xml:space="preserve">Art. 11 Ley 1150; art. 164.2.j CPACA. ANCP-CCE C-1669/2025, C-1685/2025 y C-1081/2026: aun en régimen especial la caducidad es límite; liquidar después es nulo. Conciliación improcedente (art. 90 num. 3 Ley 2220/2022).</w:t>
             </w:r>
           </w:p>
         </w:tc>
@@ -317,22 +317,37 @@
                 <w:sz w:val="17"/>
                 <w:szCs w:val="17"/>
               </w:rPr>
-              <w:t xml:space="preserve">NO firmar "acta de liquidación" ni antedatar.</w:t>
-            </w:r>
-          </w:p>
-          <w:p>
-            <w:pPr>
-              <w:spacing w:after="40"/>
-            </w:pPr>
-            <w:r>
-              <w:rPr>
-                <w:rFonts w:ascii="Arial" w:cs="Arial" w:eastAsia="Arial" w:hAnsi="Arial"/>
-                <w:b w:val="false"/>
-                <w:bCs w:val="false"/>
-                <w:sz w:val="17"/>
-                <w:szCs w:val="17"/>
-              </w:rPr>
-              <w:t xml:space="preserve">Figura que procede: ACTA DE CIERRE / CONSTANCIA DE PÉRDIDA DE COMPETENCIA Y ESTADO FINAL DEL CONTRATO (ordenador del gasto + supervisor + gerente EICE).</w:t>
+              <w:t xml:space="preserve">NO firmar nada llamado "liquidación" ni que funcione como tal (corte de cuentas, paz y salvo recíproco, transacción).</w:t>
+            </w:r>
+          </w:p>
+          <w:p>
+            <w:pPr>
+              <w:spacing w:after="40"/>
+            </w:pPr>
+            <w:r>
+              <w:rPr>
+                <w:rFonts w:ascii="Arial" w:cs="Arial" w:eastAsia="Arial" w:hAnsi="Arial"/>
+                <w:b w:val="false"/>
+                <w:bCs w:val="false"/>
+                <w:sz w:val="17"/>
+                <w:szCs w:val="17"/>
+              </w:rPr>
+              <w:t xml:space="preserve">NO antedatar.</w:t>
+            </w:r>
+          </w:p>
+          <w:p>
+            <w:pPr>
+              <w:spacing w:after="40"/>
+            </w:pPr>
+            <w:r>
+              <w:rPr>
+                <w:rFonts w:ascii="Arial" w:cs="Arial" w:eastAsia="Arial" w:hAnsi="Arial"/>
+                <w:b w:val="false"/>
+                <w:bCs w:val="false"/>
+                <w:sz w:val="17"/>
+                <w:szCs w:val="17"/>
+              </w:rPr>
+              <w:t xml:space="preserve">El resultado es el mismo si el derivado se rige por el manual o por la Ley 80.</w:t>
             </w:r>
           </w:p>
         </w:tc>
@@ -369,7 +384,7 @@
                 <w:sz w:val="17"/>
                 <w:szCs w:val="17"/>
               </w:rPr>
-              <w:t xml:space="preserve">2. Derivado CD-FC-033-2023 (EICE – contratista)</w:t>
+              <w:t xml:space="preserve">2. Figura que queda: INTERADMINISTRATIVO</w:t>
             </w:r>
           </w:p>
         </w:tc>
@@ -401,7 +416,7 @@
                 <w:sz w:val="17"/>
                 <w:szCs w:val="17"/>
               </w:rPr>
-              <w:t xml:space="preserve">Régimen especial: manual de la EICE (derecho privado). Terminó 27-nov-2023. Sin saldos.</w:t>
+              <w:t xml:space="preserve">Departamento sin competencia para liquidar. SECOP: pagado $800.063.540; pendiente $507.920.</w:t>
             </w:r>
           </w:p>
         </w:tc>
@@ -433,7 +448,7 @@
                 <w:sz w:val="17"/>
                 <w:szCs w:val="17"/>
               </w:rPr>
-              <w:t xml:space="preserve">Art. 14 Ley 1150 (mod. art. 93 Ley 1474) y art. 13 Ley 1150 (principios). El límite de competencia del art. 11 Ley 1150 está previsto para el Estatuto General; en régimen privado manda lo pactado y el manual. Art. 1602 C.C.</w:t>
+              <w:t xml:space="preserve">Manual de buenas prácticas de la Gobernación MA-CC-MA-01 v2 (Decreto 000150 de 2025), num. 6.6.6. Sala de Consulta C.E., Concepto 2253 de 2016: el cierre es trámite interno, no liquidación. Art. 2.2.1.1.2.4.3 Decreto 1082.</w:t>
             </w:r>
           </w:p>
         </w:tc>
@@ -465,37 +480,52 @@
                 <w:sz w:val="17"/>
                 <w:szCs w:val="17"/>
               </w:rPr>
-              <w:t xml:space="preserve">Revisar HOY la cláusula de liquidación y el manual.</w:t>
-            </w:r>
-          </w:p>
-          <w:p>
-            <w:pPr>
-              <w:spacing w:after="40"/>
-            </w:pPr>
-            <w:r>
-              <w:rPr>
-                <w:rFonts w:ascii="Arial" w:cs="Arial" w:eastAsia="Arial" w:hAnsi="Arial"/>
-                <w:b w:val="false"/>
-                <w:bCs w:val="false"/>
-                <w:sz w:val="17"/>
-                <w:szCs w:val="17"/>
-              </w:rPr>
-              <w:t xml:space="preserve">Si no prohíben el acuerdo tardío: firmar ACTA BILATERAL DE CIERRE, BALANCE FINAL Y FINIQUITO (EICE + contratista + supervisor/interventor).</w:t>
-            </w:r>
-          </w:p>
-          <w:p>
-            <w:pPr>
-              <w:spacing w:after="40"/>
-            </w:pPr>
-            <w:r>
-              <w:rPr>
-                <w:rFonts w:ascii="Arial" w:cs="Arial" w:eastAsia="Arial" w:hAnsi="Arial"/>
-                <w:b w:val="false"/>
-                <w:bCs w:val="false"/>
-                <w:sz w:val="17"/>
-                <w:szCs w:val="17"/>
-              </w:rPr>
-              <w:t xml:space="preserve">Si el manual remite a la Ley 1150, no llamarla "liquidación": usar "cierre y finiquito".</w:t>
+              <w:t xml:space="preserve">"ACTA DE FINALIZACIÓN Y CIERRE FINANCIERO", firmada por el SUPERVISOR, con informe final de supervisión y estado de cuenta avalado por Hacienda.</w:t>
+            </w:r>
+          </w:p>
+          <w:p>
+            <w:pPr>
+              <w:spacing w:after="40"/>
+            </w:pPr>
+            <w:r>
+              <w:rPr>
+                <w:rFonts w:ascii="Arial" w:cs="Arial" w:eastAsia="Arial" w:hAnsi="Arial"/>
+                <w:b w:val="false"/>
+                <w:bCs w:val="false"/>
+                <w:sz w:val="17"/>
+                <w:szCs w:val="17"/>
+              </w:rPr>
+              <w:t xml:space="preserve">Explicar por qué no se liquidó; liberar el saldo de $507.920 (no pagarlo).</w:t>
+            </w:r>
+          </w:p>
+          <w:p>
+            <w:pPr>
+              <w:spacing w:after="40"/>
+            </w:pPr>
+            <w:r>
+              <w:rPr>
+                <w:rFonts w:ascii="Arial" w:cs="Arial" w:eastAsia="Arial" w:hAnsi="Arial"/>
+                <w:b w:val="false"/>
+                <w:bCs w:val="false"/>
+                <w:sz w:val="17"/>
+                <w:szCs w:val="17"/>
+              </w:rPr>
+              <w:t xml:space="preserve">Publicar en SECOP II (3 días) y remitir a Control Interno Disciplinario, como ordena el manual.</w:t>
+            </w:r>
+          </w:p>
+          <w:p>
+            <w:pPr>
+              <w:spacing w:after="40"/>
+            </w:pPr>
+            <w:r>
+              <w:rPr>
+                <w:rFonts w:ascii="Arial" w:cs="Arial" w:eastAsia="Arial" w:hAnsi="Arial"/>
+                <w:b w:val="false"/>
+                <w:bCs w:val="false"/>
+                <w:sz w:val="17"/>
+                <w:szCs w:val="17"/>
+              </w:rPr>
+              <w:t xml:space="preserve">No esperar el documento del derivado: anexar lo que exista.</w:t>
             </w:r>
           </w:p>
         </w:tc>
@@ -532,7 +562,7 @@
                 <w:sz w:val="17"/>
                 <w:szCs w:val="17"/>
               </w:rPr>
-              <w:t xml:space="preserve">3. Dependencia entre contratos</w:t>
+              <w:t xml:space="preserve">3. Figura que queda: DERIVADO</w:t>
             </w:r>
           </w:p>
         </w:tc>
@@ -564,7 +594,7 @@
                 <w:sz w:val="17"/>
                 <w:szCs w:val="17"/>
               </w:rPr>
-              <w:t xml:space="preserve">El interadministrativo exige liquidar primero el derivado.</w:t>
+              <w:t xml:space="preserve">EICE sin competencia para liquidar (manual EICE, derecho privado).</w:t>
             </w:r>
           </w:p>
         </w:tc>
@@ -596,7 +626,7 @@
                 <w:sz w:val="17"/>
                 <w:szCs w:val="17"/>
               </w:rPr>
-              <w:t xml:space="preserve">Es exigencia contractual, no legal. Art. 1602 C.C.</w:t>
+              <w:t xml:space="preserve">Manual EICE, arts. 34, 36.1.6, 36.1.7 y 79.2.16; Concepto 2253 de 2016; C-1685/2025.</w:t>
             </w:r>
           </w:p>
         </w:tc>
@@ -628,7 +658,52 @@
                 <w:sz w:val="17"/>
                 <w:szCs w:val="17"/>
               </w:rPr>
-              <w:t xml:space="preserve">Orden: 1.º cierre/finiquito del derivado → 2.º acta de cierre del interadministrativo con soporte en el anterior.</w:t>
+              <w:t xml:space="preserve">"INFORME FINAL DE SUPERVISIÓN + ACTA DE BALANCE Y ESTADO FINAL DEL CONTRATO NO LIQUIDADO", interna de la EICE (supervisor, Secretaría General, Gerente).</w:t>
+            </w:r>
+          </w:p>
+          <w:p>
+            <w:pPr>
+              <w:spacing w:after="40"/>
+            </w:pPr>
+            <w:r>
+              <w:rPr>
+                <w:rFonts w:ascii="Arial" w:cs="Arial" w:eastAsia="Arial" w:hAnsi="Arial"/>
+                <w:b w:val="false"/>
+                <w:bCs w:val="false"/>
+                <w:sz w:val="17"/>
+                <w:szCs w:val="17"/>
+              </w:rPr>
+              <w:t xml:space="preserve">Solo hechos: actas, pagos, fallas 2024-2026 y su atención, estado de la póliza.</w:t>
+            </w:r>
+          </w:p>
+          <w:p>
+            <w:pPr>
+              <w:spacing w:after="40"/>
+            </w:pPr>
+            <w:r>
+              <w:rPr>
+                <w:rFonts w:ascii="Arial" w:cs="Arial" w:eastAsia="Arial" w:hAnsi="Arial"/>
+                <w:b w:val="false"/>
+                <w:bCs w:val="false"/>
+                <w:sz w:val="17"/>
+                <w:szCs w:val="17"/>
+              </w:rPr>
+              <w:t xml:space="preserve">Decir expresamente que NO es liquidación y que NO extingue la estabilidad.</w:t>
+            </w:r>
+          </w:p>
+          <w:p>
+            <w:pPr>
+              <w:spacing w:after="40"/>
+            </w:pPr>
+            <w:r>
+              <w:rPr>
+                <w:rFonts w:ascii="Arial" w:cs="Arial" w:eastAsia="Arial" w:hAnsi="Arial"/>
+                <w:b w:val="false"/>
+                <w:bCs w:val="false"/>
+                <w:sz w:val="17"/>
+                <w:szCs w:val="17"/>
+              </w:rPr>
+              <w:t xml:space="preserve">Sin pagos, sin renuncias de la EICE.</w:t>
             </w:r>
           </w:p>
         </w:tc>
@@ -665,7 +740,7 @@
                 <w:sz w:val="17"/>
                 <w:szCs w:val="17"/>
               </w:rPr>
-              <w:t xml:space="preserve">4. Contenido mínimo de las actas</w:t>
+              <w:t xml:space="preserve">4. Contratista</w:t>
             </w:r>
           </w:p>
         </w:tc>
@@ -697,7 +772,7 @@
                 <w:sz w:val="17"/>
                 <w:szCs w:val="17"/>
               </w:rPr>
-              <w:t xml:space="preserve">Debe quedar definida la situación del contrato.</w:t>
+              <w:t xml:space="preserve">Ha atendido todos los requerimientos, incluso obras fuera del objeto.</w:t>
             </w:r>
           </w:p>
         </w:tc>
@@ -729,7 +804,7 @@
                 <w:sz w:val="17"/>
                 <w:szCs w:val="17"/>
               </w:rPr>
-              <w:t xml:space="preserve">Art. 2.2.1.1.2.4.3 Decreto 1082 de 2015 (cierre del expediente al vencer las garantías).</w:t>
+              <w:t xml:space="preserve">Contrato cl. 2 par. 2 y cl. 4 par. 1; manual EICE art. 53 (sin escrito no hay contrato); art. 15 C.C. (renuncia).</w:t>
             </w:r>
           </w:p>
         </w:tc>
@@ -761,67 +836,22 @@
                 <w:sz w:val="17"/>
                 <w:szCs w:val="17"/>
               </w:rPr>
-              <w:t xml:space="preserve">Ejecución física y financiera; pagos; saldo en cero (SECOP reporta $507.920 pendientes en el interadministrativo: confirmar y liberar por acto del ordenador).</w:t>
-            </w:r>
-          </w:p>
-          <w:p>
-            <w:pPr>
-              <w:spacing w:after="40"/>
-            </w:pPr>
-            <w:r>
-              <w:rPr>
-                <w:rFonts w:ascii="Arial" w:cs="Arial" w:eastAsia="Arial" w:hAnsi="Arial"/>
-                <w:b w:val="false"/>
-                <w:bCs w:val="false"/>
-                <w:sz w:val="17"/>
-                <w:szCs w:val="17"/>
-              </w:rPr>
-              <w:t xml:space="preserve">Motivo de la no liquidación oportuna (atención de fallas en garantía y entrega a la comunidad).</w:t>
-            </w:r>
-          </w:p>
-          <w:p>
-            <w:pPr>
-              <w:spacing w:after="40"/>
-            </w:pPr>
-            <w:r>
-              <w:rPr>
-                <w:rFonts w:ascii="Arial" w:cs="Arial" w:eastAsia="Arial" w:hAnsi="Arial"/>
-                <w:b w:val="false"/>
-                <w:bCs w:val="false"/>
-                <w:sz w:val="17"/>
-                <w:szCs w:val="17"/>
-              </w:rPr>
-              <w:t xml:space="preserve">Obligaciones que siguen vigentes: estabilidad de la obra.</w:t>
-            </w:r>
-          </w:p>
-          <w:p>
-            <w:pPr>
-              <w:spacing w:after="40"/>
-            </w:pPr>
-            <w:r>
-              <w:rPr>
-                <w:rFonts w:ascii="Arial" w:cs="Arial" w:eastAsia="Arial" w:hAnsi="Arial"/>
-                <w:b w:val="false"/>
-                <w:bCs w:val="false"/>
-                <w:sz w:val="17"/>
-                <w:szCs w:val="17"/>
-              </w:rPr>
-              <w:t xml:space="preserve">Paz y salvo recíproco, salvo estabilidad.</w:t>
-            </w:r>
-          </w:p>
-          <w:p>
-            <w:pPr>
-              <w:spacing w:after="40"/>
-            </w:pPr>
-            <w:r>
-              <w:rPr>
-                <w:rFonts w:ascii="Arial" w:cs="Arial" w:eastAsia="Arial" w:hAnsi="Arial"/>
-                <w:b w:val="false"/>
-                <w:bCs w:val="false"/>
-                <w:sz w:val="17"/>
-                <w:szCs w:val="17"/>
-              </w:rPr>
-              <w:t xml:space="preserve">Publicación en SECOP II.</w:t>
+              <w:t xml:space="preserve">DECLARACIÓN UNILATERAL del contratista (documento aparte): no tiene reclamaciones; las obras ajenas al objeto fueron voluntarias y a su costo; ratifica la estabilidad.</w:t>
+            </w:r>
+          </w:p>
+          <w:p>
+            <w:pPr>
+              <w:spacing w:after="40"/>
+            </w:pPr>
+            <w:r>
+              <w:rPr>
+                <w:rFonts w:ascii="Arial" w:cs="Arial" w:eastAsia="Arial" w:hAnsi="Arial"/>
+                <w:b w:val="false"/>
+                <w:bCs w:val="false"/>
+                <w:sz w:val="17"/>
+                <w:szCs w:val="17"/>
+              </w:rPr>
+              <w:t xml:space="preserve">Solo si es veraz según la aclaración del gerente. Si un servidor las pidió, NO firmar que no fueron ordenadas: llevarlo a concepto jurídico.</w:t>
             </w:r>
           </w:p>
         </w:tc>
@@ -890,7 +920,7 @@
                 <w:sz w:val="17"/>
                 <w:szCs w:val="17"/>
               </w:rPr>
-              <w:t xml:space="preserve">Sigue vigente: no depende de la liquidación.</w:t>
+              <w:t xml:space="preserve">Póliza 3656577-4 Suramericana: estabilidad 04-jul-2023 a 04-jul-2028 por $240.019.062. El contrato exige 5 años desde el recibo final (27-nov-2023), o sea hasta ≈ nov-2028.</w:t>
             </w:r>
           </w:p>
         </w:tc>
@@ -922,7 +952,7 @@
                 <w:sz w:val="17"/>
                 <w:szCs w:val="17"/>
               </w:rPr>
-              <w:t xml:space="preserve">Vigencia según contrato (referente: mínimo 5 años desde el recibo, art. 2.2.1.2.3.1.14 Decreto 1082). Régimen privado: aviso y reclamación a la aseguradora (arts. 1075, 1077 y 1080 C.Co.).</w:t>
+              <w:t xml:space="preserve">Contrato cl. 28.1 y cl. 4 par. 1: solo se hace efectiva si el contratista no repara en el plazo fijado por escrito. Las acciones por estabilidad corren desde cada falla (C.E., 21-mar-2025, rad. 67743).</w:t>
             </w:r>
           </w:p>
         </w:tc>
@@ -954,37 +984,22 @@
                 <w:sz w:val="17"/>
                 <w:szCs w:val="17"/>
               </w:rPr>
-              <w:t xml:space="preserve">NO liberar ni renunciar a la póliza.</w:t>
-            </w:r>
-          </w:p>
-          <w:p>
-            <w:pPr>
-              <w:spacing w:after="40"/>
-            </w:pPr>
-            <w:r>
-              <w:rPr>
-                <w:rFonts w:ascii="Arial" w:cs="Arial" w:eastAsia="Arial" w:hAnsi="Arial"/>
-                <w:b w:val="false"/>
-                <w:bCs w:val="false"/>
-                <w:sz w:val="17"/>
-                <w:szCs w:val="17"/>
-              </w:rPr>
-              <w:t xml:space="preserve">Dejar de "amenazar": el siniestro exige daño por defecto constructivo imputable al contratista, no por diseño, operación o terceros.</w:t>
-            </w:r>
-          </w:p>
-          <w:p>
-            <w:pPr>
-              <w:spacing w:after="40"/>
-            </w:pPr>
-            <w:r>
-              <w:rPr>
-                <w:rFonts w:ascii="Arial" w:cs="Arial" w:eastAsia="Arial" w:hAnsi="Arial"/>
-                <w:b w:val="false"/>
-                <w:bCs w:val="false"/>
-                <w:sz w:val="17"/>
-                <w:szCs w:val="17"/>
-              </w:rPr>
-              <w:t xml:space="preserve">En el derivado la EICE no declara siniestro por acto administrativo: reclama a la aseguradora.</w:t>
+              <w:t xml:space="preserve">NO liberarla. Pedir AMPLIAR la vigencia hasta 5 años desde el recibo final (≈ nov-2028).</w:t>
+            </w:r>
+          </w:p>
+          <w:p>
+            <w:pPr>
+              <w:spacing w:after="40"/>
+            </w:pPr>
+            <w:r>
+              <w:rPr>
+                <w:rFonts w:ascii="Arial" w:cs="Arial" w:eastAsia="Arial" w:hAnsi="Arial"/>
+                <w:b w:val="false"/>
+                <w:bCs w:val="false"/>
+                <w:sz w:val="17"/>
+                <w:szCs w:val="17"/>
+              </w:rPr>
+              <w:t xml:space="preserve">Cambiar la "amenaza" por requerimientos técnicos escritos, con plazo, solo por defectos del objeto, con copia a la aseguradora.</w:t>
             </w:r>
           </w:p>
         </w:tc>
@@ -1021,7 +1036,7 @@
                 <w:sz w:val="17"/>
                 <w:szCs w:val="17"/>
               </w:rPr>
-              <w:t xml:space="preserve">6. Obras fuera del objeto</w:t>
+              <w:t xml:space="preserve">6. Entrega a la comunidad</w:t>
             </w:r>
           </w:p>
         </w:tc>
@@ -1053,7 +1068,7 @@
                 <w:sz w:val="17"/>
                 <w:szCs w:val="17"/>
               </w:rPr>
-              <w:t xml:space="preserve">Ejecutadas por presión de la comunidad (ver aclaración del gerente).</w:t>
+              <w:t xml:space="preserve">No recibían.</w:t>
             </w:r>
           </w:p>
         </w:tc>
@@ -1085,7 +1100,7 @@
                 <w:sz w:val="17"/>
                 <w:szCs w:val="17"/>
               </w:rPr>
-              <w:t xml:space="preserve">Sin contrato escrito no hay obligación de pago; prohibición de hechos cumplidos (art. 71 Decreto 111 de 1996). Riesgo de enriquecimiento sin causa si un servidor las ordenó (CE, Sección Tercera, unificación 19-nov-2012, exp. 24897).</w:t>
+              <w:t xml:space="preserve">No es requisito para liquidar ni para cerrar; cuenta el recibo de la entidad (acta de recibo final). Ley 41 de 1993: operación por asociación de usuarios.</w:t>
             </w:r>
           </w:p>
         </w:tc>
@@ -1117,22 +1132,7 @@
                 <w:sz w:val="17"/>
                 <w:szCs w:val="17"/>
               </w:rPr>
-              <w:t xml:space="preserve">NO reconocerlas ni pagarlas.</w:t>
-            </w:r>
-          </w:p>
-          <w:p>
-            <w:pPr>
-              <w:spacing w:after="40"/>
-            </w:pPr>
-            <w:r>
-              <w:rPr>
-                <w:rFonts w:ascii="Arial" w:cs="Arial" w:eastAsia="Arial" w:hAnsi="Arial"/>
-                <w:b w:val="false"/>
-                <w:bCs w:val="false"/>
-                <w:sz w:val="17"/>
-                <w:szCs w:val="17"/>
-              </w:rPr>
-              <w:t xml:space="preserve">Incluir en el finiquito una declaración del contratista: fueron voluntarias, a su costo, sin orden de la entidad, y renuncia a reclamarlas (art. 15 C.C.).</w:t>
+              <w:t xml:space="preserve">Hacerla aparte: acta de entrega al municipio o asociación con manual de operación y mantenimiento; si se niegan, dejar constancia.</w:t>
             </w:r>
           </w:p>
         </w:tc>
@@ -1169,7 +1169,7 @@
                 <w:sz w:val="17"/>
                 <w:szCs w:val="17"/>
               </w:rPr>
-              <w:t xml:space="preserve">7. Entrega a la comunidad</w:t>
+              <w:t xml:space="preserve">7. Responsabilidad de servidores</w:t>
             </w:r>
           </w:p>
         </w:tc>
@@ -1201,7 +1201,7 @@
                 <w:sz w:val="17"/>
                 <w:szCs w:val="17"/>
               </w:rPr>
-              <w:t xml:space="preserve">La comunidad no recibía.</w:t>
+              <w:t xml:space="preserve">Sin saldos perdidos. OJO: el último 10% estaba atado a la liquidación (derivado cl. 13; interadministrativo par. 2) y se pagó igual.</w:t>
             </w:r>
           </w:p>
         </w:tc>
@@ -1233,7 +1233,7 @@
                 <w:sz w:val="17"/>
                 <w:szCs w:val="17"/>
               </w:rPr>
-              <w:t xml:space="preserve">No es requisito legal para liquidar ni cerrar: cuenta el recibo a satisfacción de la entidad. Ley 41 de 1993 (operación por asociación de usuarios).</w:t>
+              <w:t xml:space="preserve">Fiscal: sin daño no hay responsabilidad (art. 6 Ley 610/2000). Disciplinaria: ilicitud sustancial (art. 9 Ley 1952/2019).</w:t>
             </w:r>
           </w:p>
         </w:tc>
@@ -1265,37 +1265,22 @@
                 <w:sz w:val="17"/>
                 <w:szCs w:val="17"/>
               </w:rPr>
-              <w:t xml:space="preserve">Separarla del cierre.</w:t>
-            </w:r>
-          </w:p>
-          <w:p>
-            <w:pPr>
-              <w:spacing w:after="40"/>
-            </w:pPr>
-            <w:r>
-              <w:rPr>
-                <w:rFonts w:ascii="Arial" w:cs="Arial" w:eastAsia="Arial" w:hAnsi="Arial"/>
-                <w:b w:val="false"/>
-                <w:bCs w:val="false"/>
-                <w:sz w:val="17"/>
-                <w:szCs w:val="17"/>
-              </w:rPr>
-              <w:t xml:space="preserve">Acta de entrega al municipio y/o asociación de usuarios con manual de operación y mantenimiento.</w:t>
-            </w:r>
-          </w:p>
-          <w:p>
-            <w:pPr>
-              <w:spacing w:after="40"/>
-            </w:pPr>
-            <w:r>
-              <w:rPr>
-                <w:rFonts w:ascii="Arial" w:cs="Arial" w:eastAsia="Arial" w:hAnsi="Arial"/>
-                <w:b w:val="false"/>
-                <w:bCs w:val="false"/>
-                <w:sz w:val="17"/>
-                <w:szCs w:val="17"/>
-              </w:rPr>
-              <w:t xml:space="preserve">Si se niegan: dejar constancia y entregar al municipio.</w:t>
+              <w:t xml:space="preserve">Memorando cronológico con soportes (fallas, requerimientos, reparaciones 2024-2026) que justifique la demora.</w:t>
+            </w:r>
+          </w:p>
+          <w:p>
+            <w:pPr>
+              <w:spacing w:after="40"/>
+            </w:pPr>
+            <w:r>
+              <w:rPr>
+                <w:rFonts w:ascii="Arial" w:cs="Arial" w:eastAsia="Arial" w:hAnsi="Arial"/>
+                <w:b w:val="false"/>
+                <w:bCs w:val="false"/>
+                <w:sz w:val="17"/>
+                <w:szCs w:val="17"/>
+              </w:rPr>
+              <w:t xml:space="preserve">Relatar los hechos tal como son en las actas; no ocultar el pago del 10%.</w:t>
             </w:r>
           </w:p>
         </w:tc>
@@ -1332,7 +1317,7 @@
                 <w:sz w:val="17"/>
                 <w:szCs w:val="17"/>
               </w:rPr>
-              <w:t xml:space="preserve">8. Responsabilidad de servidores</w:t>
+              <w:t xml:space="preserve">8. Orden</w:t>
             </w:r>
           </w:p>
         </w:tc>
@@ -1364,7 +1349,7 @@
                 <w:sz w:val="17"/>
                 <w:szCs w:val="17"/>
               </w:rPr>
-              <w:t xml:space="preserve">Liquidación no hecha a tiempo.</w:t>
+              <w:t xml:space="preserve"/>
             </w:r>
           </w:p>
         </w:tc>
@@ -1396,7 +1381,7 @@
                 <w:sz w:val="17"/>
                 <w:szCs w:val="17"/>
               </w:rPr>
-              <w:t xml:space="preserve">Fiscal: sin daño patrimonial no hay responsabilidad (art. 6 Ley 610 de 2000); no hay saldos. Disciplinaria: ilicitud sustancial (art. 9 Ley 1952 de 2019): hubo justificación.</w:t>
+              <w:t xml:space="preserve"/>
             </w:r>
           </w:p>
         </w:tc>
@@ -1428,423 +1413,82 @@
                 <w:sz w:val="17"/>
                 <w:szCs w:val="17"/>
               </w:rPr>
-              <w:t xml:space="preserve">Dejar la justificación por escrito en las actas, con soportes de los requerimientos y arreglos 2024-2026.</w:t>
-            </w:r>
-          </w:p>
-          <w:p>
-            <w:pPr>
-              <w:spacing w:after="40"/>
-            </w:pPr>
-            <w:r>
-              <w:rPr>
-                <w:rFonts w:ascii="Arial" w:cs="Arial" w:eastAsia="Arial" w:hAnsi="Arial"/>
-                <w:b w:val="false"/>
-                <w:bCs w:val="false"/>
-                <w:sz w:val="17"/>
-                <w:szCs w:val="17"/>
-              </w:rPr>
-              <w:t xml:space="preserve">Informar a control interno; plan de mejoramiento si la Contraloría lo pide.</w:t>
-            </w:r>
-          </w:p>
-        </w:tc>
-      </w:tr>
-      <w:tr>
-        <w:trPr>
-          <w:tblHeader w:val="false"/>
-        </w:trPr>
-        <w:tc>
-          <w:tcPr>
-            <w:tcW w:type="dxa" w:w="2100"/>
-            <w:tcBorders>
-              <w:top w:val="single" w:color="000000" w:sz="6"/>
-              <w:left w:val="single" w:color="000000" w:sz="6"/>
-              <w:bottom w:val="single" w:color="000000" w:sz="6"/>
-              <w:right w:val="single" w:color="000000" w:sz="6"/>
-            </w:tcBorders>
-            <w:tcMar>
-              <w:top w:type="dxa" w:w="60"/>
-              <w:left w:type="dxa" w:w="90"/>
-              <w:bottom w:type="dxa" w:w="60"/>
-              <w:right w:type="dxa" w:w="90"/>
-            </w:tcMar>
-          </w:tcPr>
-          <w:p>
-            <w:pPr>
-              <w:spacing w:after="40"/>
-            </w:pPr>
-            <w:r>
-              <w:rPr>
-                <w:rFonts w:ascii="Arial" w:cs="Arial" w:eastAsia="Arial" w:hAnsi="Arial"/>
-                <w:b/>
-                <w:bCs/>
-                <w:sz w:val="17"/>
-                <w:szCs w:val="17"/>
-              </w:rPr>
-              <w:t xml:space="preserve">9. Qué NO hacer</w:t>
-            </w:r>
-          </w:p>
-        </w:tc>
-        <w:tc>
-          <w:tcPr>
-            <w:tcW w:type="dxa" w:w="3500"/>
-            <w:tcBorders>
-              <w:top w:val="single" w:color="000000" w:sz="6"/>
-              <w:left w:val="single" w:color="000000" w:sz="6"/>
-              <w:bottom w:val="single" w:color="000000" w:sz="6"/>
-              <w:right w:val="single" w:color="000000" w:sz="6"/>
-            </w:tcBorders>
-            <w:tcMar>
-              <w:top w:type="dxa" w:w="60"/>
-              <w:left w:type="dxa" w:w="90"/>
-              <w:bottom w:type="dxa" w:w="60"/>
-              <w:right w:type="dxa" w:w="90"/>
-            </w:tcMar>
-          </w:tcPr>
-          <w:p>
-            <w:pPr>
-              <w:spacing w:after="40"/>
-            </w:pPr>
-            <w:r>
-              <w:rPr>
-                <w:rFonts w:ascii="Arial" w:cs="Arial" w:eastAsia="Arial" w:hAnsi="Arial"/>
-                <w:b w:val="false"/>
-                <w:bCs w:val="false"/>
-                <w:sz w:val="17"/>
-                <w:szCs w:val="17"/>
-              </w:rPr>
-              <w:t xml:space="preserve"/>
-            </w:r>
-          </w:p>
-        </w:tc>
-        <w:tc>
-          <w:tcPr>
-            <w:tcW w:type="dxa" w:w="3300"/>
-            <w:tcBorders>
-              <w:top w:val="single" w:color="000000" w:sz="6"/>
-              <w:left w:val="single" w:color="000000" w:sz="6"/>
-              <w:bottom w:val="single" w:color="000000" w:sz="6"/>
-              <w:right w:val="single" w:color="000000" w:sz="6"/>
-            </w:tcBorders>
-            <w:tcMar>
-              <w:top w:type="dxa" w:w="60"/>
-              <w:left w:type="dxa" w:w="90"/>
-              <w:bottom w:type="dxa" w:w="60"/>
-              <w:right w:type="dxa" w:w="90"/>
-            </w:tcMar>
-          </w:tcPr>
-          <w:p>
-            <w:pPr>
-              <w:spacing w:after="40"/>
-            </w:pPr>
-            <w:r>
-              <w:rPr>
-                <w:rFonts w:ascii="Arial" w:cs="Arial" w:eastAsia="Arial" w:hAnsi="Arial"/>
-                <w:b w:val="false"/>
-                <w:bCs w:val="false"/>
-                <w:sz w:val="17"/>
-                <w:szCs w:val="17"/>
-              </w:rPr>
-              <w:t xml:space="preserve"/>
-            </w:r>
-          </w:p>
-        </w:tc>
-        <w:tc>
-          <w:tcPr>
-            <w:tcW w:type="dxa" w:w="5100"/>
-            <w:tcBorders>
-              <w:top w:val="single" w:color="000000" w:sz="6"/>
-              <w:left w:val="single" w:color="000000" w:sz="6"/>
-              <w:bottom w:val="single" w:color="000000" w:sz="6"/>
-              <w:right w:val="single" w:color="000000" w:sz="6"/>
-            </w:tcBorders>
-            <w:tcMar>
-              <w:top w:type="dxa" w:w="60"/>
-              <w:left w:type="dxa" w:w="90"/>
-              <w:bottom w:type="dxa" w:w="60"/>
-              <w:right w:type="dxa" w:w="90"/>
-            </w:tcMar>
-          </w:tcPr>
-          <w:p>
-            <w:pPr>
-              <w:spacing w:after="40"/>
-            </w:pPr>
-            <w:r>
-              <w:rPr>
-                <w:rFonts w:ascii="Arial" w:cs="Arial" w:eastAsia="Arial" w:hAnsi="Arial"/>
-                <w:b w:val="false"/>
-                <w:bCs w:val="false"/>
-                <w:sz w:val="17"/>
-                <w:szCs w:val="17"/>
-              </w:rPr>
-              <w:t xml:space="preserve">Antedatar documentos.</w:t>
-            </w:r>
-          </w:p>
-          <w:p>
-            <w:pPr>
-              <w:spacing w:after="40"/>
-            </w:pPr>
-            <w:r>
-              <w:rPr>
-                <w:rFonts w:ascii="Arial" w:cs="Arial" w:eastAsia="Arial" w:hAnsi="Arial"/>
-                <w:b w:val="false"/>
-                <w:bCs w:val="false"/>
-                <w:sz w:val="17"/>
-                <w:szCs w:val="17"/>
-              </w:rPr>
-              <w:t xml:space="preserve">Firmar "liquidación" del interadministrativo.</w:t>
-            </w:r>
-          </w:p>
-          <w:p>
-            <w:pPr>
-              <w:spacing w:after="40"/>
-            </w:pPr>
-            <w:r>
-              <w:rPr>
-                <w:rFonts w:ascii="Arial" w:cs="Arial" w:eastAsia="Arial" w:hAnsi="Arial"/>
-                <w:b w:val="false"/>
-                <w:bCs w:val="false"/>
-                <w:sz w:val="17"/>
-                <w:szCs w:val="17"/>
-              </w:rPr>
-              <w:t xml:space="preserve">Pagar o reconocer obras extra.</w:t>
-            </w:r>
-          </w:p>
-          <w:p>
-            <w:pPr>
-              <w:spacing w:after="40"/>
-            </w:pPr>
-            <w:r>
-              <w:rPr>
-                <w:rFonts w:ascii="Arial" w:cs="Arial" w:eastAsia="Arial" w:hAnsi="Arial"/>
-                <w:b w:val="false"/>
-                <w:bCs w:val="false"/>
-                <w:sz w:val="17"/>
-                <w:szCs w:val="17"/>
-              </w:rPr>
-              <w:t xml:space="preserve">Liberar la póliza.</w:t>
-            </w:r>
-          </w:p>
-          <w:p>
-            <w:pPr>
-              <w:spacing w:after="40"/>
-            </w:pPr>
-            <w:r>
-              <w:rPr>
-                <w:rFonts w:ascii="Arial" w:cs="Arial" w:eastAsia="Arial" w:hAnsi="Arial"/>
-                <w:b w:val="false"/>
-                <w:bCs w:val="false"/>
-                <w:sz w:val="17"/>
-                <w:szCs w:val="17"/>
-              </w:rPr>
-              <w:t xml:space="preserve">Declarar siniestro por acto administrativo en el derivado.</w:t>
-            </w:r>
-          </w:p>
-        </w:tc>
-      </w:tr>
-      <w:tr>
-        <w:trPr>
-          <w:tblHeader w:val="false"/>
-        </w:trPr>
-        <w:tc>
-          <w:tcPr>
-            <w:tcW w:type="dxa" w:w="2100"/>
-            <w:tcBorders>
-              <w:top w:val="single" w:color="000000" w:sz="6"/>
-              <w:left w:val="single" w:color="000000" w:sz="6"/>
-              <w:bottom w:val="single" w:color="000000" w:sz="6"/>
-              <w:right w:val="single" w:color="000000" w:sz="6"/>
-            </w:tcBorders>
-            <w:tcMar>
-              <w:top w:type="dxa" w:w="60"/>
-              <w:left w:type="dxa" w:w="90"/>
-              <w:bottom w:type="dxa" w:w="60"/>
-              <w:right w:type="dxa" w:w="90"/>
-            </w:tcMar>
-          </w:tcPr>
-          <w:p>
-            <w:pPr>
-              <w:spacing w:after="40"/>
-            </w:pPr>
-            <w:r>
-              <w:rPr>
-                <w:rFonts w:ascii="Arial" w:cs="Arial" w:eastAsia="Arial" w:hAnsi="Arial"/>
-                <w:b/>
-                <w:bCs/>
-                <w:sz w:val="17"/>
-                <w:szCs w:val="17"/>
-              </w:rPr>
-              <w:t xml:space="preserve">10. Datos que hay que llevar</w:t>
-            </w:r>
-          </w:p>
-        </w:tc>
-        <w:tc>
-          <w:tcPr>
-            <w:tcW w:type="dxa" w:w="3500"/>
-            <w:tcBorders>
-              <w:top w:val="single" w:color="000000" w:sz="6"/>
-              <w:left w:val="single" w:color="000000" w:sz="6"/>
-              <w:bottom w:val="single" w:color="000000" w:sz="6"/>
-              <w:right w:val="single" w:color="000000" w:sz="6"/>
-            </w:tcBorders>
-            <w:tcMar>
-              <w:top w:type="dxa" w:w="60"/>
-              <w:left w:type="dxa" w:w="90"/>
-              <w:bottom w:type="dxa" w:w="60"/>
-              <w:right w:type="dxa" w:w="90"/>
-            </w:tcMar>
-          </w:tcPr>
-          <w:p>
-            <w:pPr>
-              <w:spacing w:after="40"/>
-            </w:pPr>
-            <w:r>
-              <w:rPr>
-                <w:rFonts w:ascii="Arial" w:cs="Arial" w:eastAsia="Arial" w:hAnsi="Arial"/>
-                <w:b w:val="false"/>
-                <w:bCs w:val="false"/>
-                <w:sz w:val="17"/>
-                <w:szCs w:val="17"/>
-              </w:rPr>
-              <w:t xml:space="preserve"/>
-            </w:r>
-          </w:p>
-        </w:tc>
-        <w:tc>
-          <w:tcPr>
-            <w:tcW w:type="dxa" w:w="3300"/>
-            <w:tcBorders>
-              <w:top w:val="single" w:color="000000" w:sz="6"/>
-              <w:left w:val="single" w:color="000000" w:sz="6"/>
-              <w:bottom w:val="single" w:color="000000" w:sz="6"/>
-              <w:right w:val="single" w:color="000000" w:sz="6"/>
-            </w:tcBorders>
-            <w:tcMar>
-              <w:top w:type="dxa" w:w="60"/>
-              <w:left w:type="dxa" w:w="90"/>
-              <w:bottom w:type="dxa" w:w="60"/>
-              <w:right w:type="dxa" w:w="90"/>
-            </w:tcMar>
-          </w:tcPr>
-          <w:p>
-            <w:pPr>
-              <w:spacing w:after="40"/>
-            </w:pPr>
-            <w:r>
-              <w:rPr>
-                <w:rFonts w:ascii="Arial" w:cs="Arial" w:eastAsia="Arial" w:hAnsi="Arial"/>
-                <w:b w:val="false"/>
-                <w:bCs w:val="false"/>
-                <w:sz w:val="17"/>
-                <w:szCs w:val="17"/>
-              </w:rPr>
-              <w:t xml:space="preserve"/>
-            </w:r>
-          </w:p>
-        </w:tc>
-        <w:tc>
-          <w:tcPr>
-            <w:tcW w:type="dxa" w:w="5100"/>
-            <w:tcBorders>
-              <w:top w:val="single" w:color="000000" w:sz="6"/>
-              <w:left w:val="single" w:color="000000" w:sz="6"/>
-              <w:bottom w:val="single" w:color="000000" w:sz="6"/>
-              <w:right w:val="single" w:color="000000" w:sz="6"/>
-            </w:tcBorders>
-            <w:tcMar>
-              <w:top w:type="dxa" w:w="60"/>
-              <w:left w:type="dxa" w:w="90"/>
-              <w:bottom w:type="dxa" w:w="60"/>
-              <w:right w:type="dxa" w:w="90"/>
-            </w:tcMar>
-          </w:tcPr>
-          <w:p>
-            <w:pPr>
-              <w:spacing w:after="40"/>
-            </w:pPr>
-            <w:r>
-              <w:rPr>
-                <w:rFonts w:ascii="Arial" w:cs="Arial" w:eastAsia="Arial" w:hAnsi="Arial"/>
-                <w:b w:val="false"/>
-                <w:bCs w:val="false"/>
-                <w:sz w:val="17"/>
-                <w:szCs w:val="17"/>
-              </w:rPr>
-              <w:t xml:space="preserve">Manual de la EICE y cláusula de liquidación.</w:t>
-            </w:r>
-          </w:p>
-          <w:p>
-            <w:pPr>
-              <w:spacing w:after="40"/>
-            </w:pPr>
-            <w:r>
-              <w:rPr>
-                <w:rFonts w:ascii="Arial" w:cs="Arial" w:eastAsia="Arial" w:hAnsi="Arial"/>
-                <w:b w:val="false"/>
-                <w:bCs w:val="false"/>
-                <w:sz w:val="17"/>
-                <w:szCs w:val="17"/>
-              </w:rPr>
-              <w:t xml:space="preserve">Acta de recibo final.</w:t>
-            </w:r>
-          </w:p>
-          <w:p>
-            <w:pPr>
-              <w:spacing w:after="40"/>
-            </w:pPr>
-            <w:r>
-              <w:rPr>
-                <w:rFonts w:ascii="Arial" w:cs="Arial" w:eastAsia="Arial" w:hAnsi="Arial"/>
-                <w:b w:val="false"/>
-                <w:bCs w:val="false"/>
-                <w:sz w:val="17"/>
-                <w:szCs w:val="17"/>
-              </w:rPr>
-              <w:t xml:space="preserve">Póliza: número, aseguradora y vigencia.</w:t>
-            </w:r>
-          </w:p>
-          <w:p>
-            <w:pPr>
-              <w:spacing w:after="40"/>
-            </w:pPr>
-            <w:r>
-              <w:rPr>
-                <w:rFonts w:ascii="Arial" w:cs="Arial" w:eastAsia="Arial" w:hAnsi="Arial"/>
-                <w:b w:val="false"/>
-                <w:bCs w:val="false"/>
-                <w:sz w:val="17"/>
-                <w:szCs w:val="17"/>
-              </w:rPr>
-              <w:t xml:space="preserve">Aclaración del gerente.</w:t>
-            </w:r>
-          </w:p>
-          <w:p>
-            <w:pPr>
-              <w:spacing w:after="40"/>
-            </w:pPr>
-            <w:r>
-              <w:rPr>
-                <w:rFonts w:ascii="Arial" w:cs="Arial" w:eastAsia="Arial" w:hAnsi="Arial"/>
-                <w:b w:val="false"/>
-                <w:bCs w:val="false"/>
-                <w:sz w:val="17"/>
-                <w:szCs w:val="17"/>
-              </w:rPr>
-              <w:t xml:space="preserve">Informe de supervisión.</w:t>
-            </w:r>
-          </w:p>
-          <w:p>
-            <w:pPr>
-              <w:spacing w:after="40"/>
-            </w:pPr>
-            <w:r>
-              <w:rPr>
-                <w:rFonts w:ascii="Arial" w:cs="Arial" w:eastAsia="Arial" w:hAnsi="Arial"/>
-                <w:b w:val="false"/>
-                <w:bCs w:val="false"/>
-                <w:sz w:val="17"/>
-                <w:szCs w:val="17"/>
-              </w:rPr>
-              <w:t xml:space="preserve">Certificado de saldo presupuestal (los $507.920).</w:t>
+              <w:t xml:space="preserve">1) Supervisor del Departamento: acta de finalización y cierre financiero.</w:t>
+            </w:r>
+          </w:p>
+          <w:p>
+            <w:pPr>
+              <w:spacing w:after="40"/>
+            </w:pPr>
+            <w:r>
+              <w:rPr>
+                <w:rFonts w:ascii="Arial" w:cs="Arial" w:eastAsia="Arial" w:hAnsi="Arial"/>
+                <w:b w:val="false"/>
+                <w:bCs w:val="false"/>
+                <w:sz w:val="17"/>
+                <w:szCs w:val="17"/>
+              </w:rPr>
+              <w:t xml:space="preserve">2) EICE: informe final y acta de estado final del derivado.</w:t>
+            </w:r>
+          </w:p>
+          <w:p>
+            <w:pPr>
+              <w:spacing w:after="40"/>
+            </w:pPr>
+            <w:r>
+              <w:rPr>
+                <w:rFonts w:ascii="Arial" w:cs="Arial" w:eastAsia="Arial" w:hAnsi="Arial"/>
+                <w:b w:val="false"/>
+                <w:bCs w:val="false"/>
+                <w:sz w:val="17"/>
+                <w:szCs w:val="17"/>
+              </w:rPr>
+              <w:t xml:space="preserve">3) Contratista: declaración unilateral y ampliación de la póliza.</w:t>
+            </w:r>
+          </w:p>
+          <w:p>
+            <w:pPr>
+              <w:spacing w:after="40"/>
+            </w:pPr>
+            <w:r>
+              <w:rPr>
+                <w:rFonts w:ascii="Arial" w:cs="Arial" w:eastAsia="Arial" w:hAnsi="Arial"/>
+                <w:b w:val="false"/>
+                <w:bCs w:val="false"/>
+                <w:sz w:val="17"/>
+                <w:szCs w:val="17"/>
+              </w:rPr>
+              <w:t xml:space="preserve">4) Entrega a comunidad o municipio.</w:t>
+            </w:r>
+          </w:p>
+          <w:p>
+            <w:pPr>
+              <w:spacing w:after="40"/>
+            </w:pPr>
+            <w:r>
+              <w:rPr>
+                <w:rFonts w:ascii="Arial" w:cs="Arial" w:eastAsia="Arial" w:hAnsi="Arial"/>
+                <w:b w:val="false"/>
+                <w:bCs w:val="false"/>
+                <w:sz w:val="17"/>
+                <w:szCs w:val="17"/>
+              </w:rPr>
+              <w:t xml:space="preserve">5) Publicar todo en SECOP II.</w:t>
+            </w:r>
+          </w:p>
+          <w:p>
+            <w:pPr>
+              <w:spacing w:after="40"/>
+            </w:pPr>
+            <w:r>
+              <w:rPr>
+                <w:rFonts w:ascii="Arial" w:cs="Arial" w:eastAsia="Arial" w:hAnsi="Arial"/>
+                <w:b w:val="false"/>
+                <w:bCs w:val="false"/>
+                <w:sz w:val="17"/>
+                <w:szCs w:val="17"/>
+              </w:rPr>
+              <w:t xml:space="preserve">6) Cierre definitivo del expediente al vencer la estabilidad (2028).</w:t>
             </w:r>
           </w:p>
         </w:tc>
@@ -1877,7 +1521,7 @@
           <w:sz w:val="17"/>
           <w:szCs w:val="17"/>
         </w:rPr>
-        <w:t xml:space="preserve">Tesis: el interadministrativo ya no puede liquidarse y se cierra con acta de cierre o constancia de estado final; el derivado, por ser de régimen privado, puede cerrarse hoy por acuerdo bilateral (finiquito), sujeto a lo que diga el manual de la EICE. La póliza de estabilidad sigue vigente. No hay saldos, luego no hay daño fiscal.</w:t>
+        <w:t xml:space="preserve">Tesis: ninguno de los dos contratos puede liquidarse ya (venció la caducidad). La figura que procede es el CIERRE sin liquidación: en el Departamento, acta de finalización y cierre financiero del supervisor; en la EICE, acta de balance y estado final del contrato no liquidado. Más la declaración del contratista y la póliza de estabilidad vigente hasta 2028. No hay recursos perdidos, luego no hay daño fiscal.</w:t>
       </w:r>
     </w:p>
     <w:sectPr>

</xml_diff>

<commit_message>
Versión 3 del cuadro: papel de la Jefatura de Gabinete y condiciones de la carta del contratista
Co-Authored-By: Claude Opus 5.5 <noreply@anthropic.com>
Claude-Session: https://claude.ai/code/session_01GubghtsGLjP6KP7VAyJTD5
</commit_message>
<xml_diff>
--- a/caso-faro-distrito-riego-la-carrera/Pautas_cierre_contratos_Distrito_Riego_La_Carrera.docx
+++ b/caso-faro-distrito-riego-la-carrera/Pautas_cierre_contratos_Distrito_Riego_La_Carrera.docx
@@ -31,7 +31,7 @@
           <w:sz w:val="17"/>
           <w:szCs w:val="17"/>
         </w:rPr>
-        <w:t xml:space="preserve">CI-SADR-04090-2022 (Departamento Norte de Santander – EICE Faro del Catatumbo S.A.S.) y CD-FC-033-2023 (EICE – contratista). Reunión Jefatura de Gabinete, 22-oct-2026. VERSIÓN 2 (corregida tras verificación).</w:t>
+        <w:t xml:space="preserve">CI-SADR-04090-2022 (Departamento Norte de Santander – EICE Faro del Catatumbo S.A.S.) y CD-FC-033-2023 (EICE – contratista). Reunión Jefatura de Gabinete, 22-oct-2026. VERSIÓN 3 (verificada).</w:t>
       </w:r>
     </w:p>
     <w:tbl>
@@ -836,7 +836,22 @@
                 <w:sz w:val="17"/>
                 <w:szCs w:val="17"/>
               </w:rPr>
-              <w:t xml:space="preserve">DECLARACIÓN UNILATERAL del contratista (documento aparte): no tiene reclamaciones; las obras ajenas al objeto fueron voluntarias y a su costo; ratifica la estabilidad.</w:t>
+              <w:t xml:space="preserve">CARTA PROPIA Y ESPONTÁNEA del contratista (la entidad solo acusa recibo): no tiene reclamaciones; las obras ajenas al objeto fueron voluntarias y a su costo; ratifica la estabilidad.</w:t>
+            </w:r>
+          </w:p>
+          <w:p>
+            <w:pPr>
+              <w:spacing w:after="40"/>
+            </w:pPr>
+            <w:r>
+              <w:rPr>
+                <w:rFonts w:ascii="Arial" w:cs="Arial" w:eastAsia="Arial" w:hAnsi="Arial"/>
+                <w:b w:val="false"/>
+                <w:bCs w:val="false"/>
+                <w:sz w:val="17"/>
+                <w:szCs w:val="17"/>
+              </w:rPr>
+              <w:t xml:space="preserve">Primero retirar por escrito cualquier amenaza. NUNCA a cambio de no hacer efectiva la póliza (art. 5 num. 3 Ley 80; vicio de fuerza).</w:t>
             </w:r>
           </w:p>
           <w:p>
@@ -1317,7 +1332,170 @@
                 <w:sz w:val="17"/>
                 <w:szCs w:val="17"/>
               </w:rPr>
-              <w:t xml:space="preserve">8. Orden</w:t>
+              <w:t xml:space="preserve">8. Papel de la Jefatura de Gabinete</w:t>
+            </w:r>
+          </w:p>
+        </w:tc>
+        <w:tc>
+          <w:tcPr>
+            <w:tcW w:type="dxa" w:w="3500"/>
+            <w:tcBorders>
+              <w:top w:val="single" w:color="000000" w:sz="6"/>
+              <w:left w:val="single" w:color="000000" w:sz="6"/>
+              <w:bottom w:val="single" w:color="000000" w:sz="6"/>
+              <w:right w:val="single" w:color="000000" w:sz="6"/>
+            </w:tcBorders>
+            <w:tcMar>
+              <w:top w:type="dxa" w:w="60"/>
+              <w:left w:type="dxa" w:w="90"/>
+              <w:bottom w:type="dxa" w:w="60"/>
+              <w:right w:type="dxa" w:w="90"/>
+            </w:tcMar>
+          </w:tcPr>
+          <w:p>
+            <w:pPr>
+              <w:spacing w:after="40"/>
+            </w:pPr>
+            <w:r>
+              <w:rPr>
+                <w:rFonts w:ascii="Arial" w:cs="Arial" w:eastAsia="Arial" w:hAnsi="Arial"/>
+                <w:b w:val="false"/>
+                <w:bCs w:val="false"/>
+                <w:sz w:val="17"/>
+                <w:szCs w:val="17"/>
+              </w:rPr>
+              <w:t xml:space="preserve">Ha requerido al contratista con amenaza de póliza.</w:t>
+            </w:r>
+          </w:p>
+        </w:tc>
+        <w:tc>
+          <w:tcPr>
+            <w:tcW w:type="dxa" w:w="3300"/>
+            <w:tcBorders>
+              <w:top w:val="single" w:color="000000" w:sz="6"/>
+              <w:left w:val="single" w:color="000000" w:sz="6"/>
+              <w:bottom w:val="single" w:color="000000" w:sz="6"/>
+              <w:right w:val="single" w:color="000000" w:sz="6"/>
+            </w:tcBorders>
+            <w:tcMar>
+              <w:top w:type="dxa" w:w="60"/>
+              <w:left w:type="dxa" w:w="90"/>
+              <w:bottom w:type="dxa" w:w="60"/>
+              <w:right w:type="dxa" w:w="90"/>
+            </w:tcMar>
+          </w:tcPr>
+          <w:p>
+            <w:pPr>
+              <w:spacing w:after="40"/>
+            </w:pPr>
+            <w:r>
+              <w:rPr>
+                <w:rFonts w:ascii="Arial" w:cs="Arial" w:eastAsia="Arial" w:hAnsi="Arial"/>
+                <w:b w:val="false"/>
+                <w:bCs w:val="false"/>
+                <w:sz w:val="17"/>
+                <w:szCs w:val="17"/>
+              </w:rPr>
+              <w:t xml:space="preserve">El Departamento no es parte del derivado (art. 1602 C.C.): requiere la supervisión de la EICE. Amenazar con la póliza para obtener obras ajenas al objeto es constreñimiento: falla del servicio (C.E., Sala Plena Secc. 3.ª, SU 31-jul-2025, exp. 57.464). Reparación directa: 2 años desde cada hecho.</w:t>
+            </w:r>
+          </w:p>
+        </w:tc>
+        <w:tc>
+          <w:tcPr>
+            <w:tcW w:type="dxa" w:w="5100"/>
+            <w:tcBorders>
+              <w:top w:val="single" w:color="000000" w:sz="6"/>
+              <w:left w:val="single" w:color="000000" w:sz="6"/>
+              <w:bottom w:val="single" w:color="000000" w:sz="6"/>
+              <w:right w:val="single" w:color="000000" w:sz="6"/>
+            </w:tcBorders>
+            <w:tcMar>
+              <w:top w:type="dxa" w:w="60"/>
+              <w:left w:type="dxa" w:w="90"/>
+              <w:bottom w:type="dxa" w:w="60"/>
+              <w:right w:type="dxa" w:w="90"/>
+            </w:tcMar>
+          </w:tcPr>
+          <w:p>
+            <w:pPr>
+              <w:spacing w:after="40"/>
+            </w:pPr>
+            <w:r>
+              <w:rPr>
+                <w:rFonts w:ascii="Arial" w:cs="Arial" w:eastAsia="Arial" w:hAnsi="Arial"/>
+                <w:b w:val="false"/>
+                <w:bCs w:val="false"/>
+                <w:sz w:val="17"/>
+                <w:szCs w:val="17"/>
+              </w:rPr>
+              <w:t xml:space="preserve">Canalizar todo requerimiento por la supervisión de la EICE.</w:t>
+            </w:r>
+          </w:p>
+          <w:p>
+            <w:pPr>
+              <w:spacing w:after="40"/>
+            </w:pPr>
+            <w:r>
+              <w:rPr>
+                <w:rFonts w:ascii="Arial" w:cs="Arial" w:eastAsia="Arial" w:hAnsi="Arial"/>
+                <w:b w:val="false"/>
+                <w:bCs w:val="false"/>
+                <w:sz w:val="17"/>
+                <w:szCs w:val="17"/>
+              </w:rPr>
+              <w:t xml:space="preserve">Solo por defectos del objeto, por escrito y con plazo.</w:t>
+            </w:r>
+          </w:p>
+          <w:p>
+            <w:pPr>
+              <w:spacing w:after="40"/>
+            </w:pPr>
+            <w:r>
+              <w:rPr>
+                <w:rFonts w:ascii="Arial" w:cs="Arial" w:eastAsia="Arial" w:hAnsi="Arial"/>
+                <w:b w:val="false"/>
+                <w:bCs w:val="false"/>
+                <w:sz w:val="17"/>
+                <w:szCs w:val="17"/>
+              </w:rPr>
+              <w:t xml:space="preserve">Riesgo vivo hasta 2027-2028 por lo exigido en 2025-2026.</w:t>
+            </w:r>
+          </w:p>
+        </w:tc>
+      </w:tr>
+      <w:tr>
+        <w:trPr>
+          <w:tblHeader w:val="false"/>
+        </w:trPr>
+        <w:tc>
+          <w:tcPr>
+            <w:tcW w:type="dxa" w:w="2100"/>
+            <w:tcBorders>
+              <w:top w:val="single" w:color="000000" w:sz="6"/>
+              <w:left w:val="single" w:color="000000" w:sz="6"/>
+              <w:bottom w:val="single" w:color="000000" w:sz="6"/>
+              <w:right w:val="single" w:color="000000" w:sz="6"/>
+            </w:tcBorders>
+            <w:tcMar>
+              <w:top w:type="dxa" w:w="60"/>
+              <w:left w:type="dxa" w:w="90"/>
+              <w:bottom w:type="dxa" w:w="60"/>
+              <w:right w:type="dxa" w:w="90"/>
+            </w:tcMar>
+          </w:tcPr>
+          <w:p>
+            <w:pPr>
+              <w:spacing w:after="40"/>
+            </w:pPr>
+            <w:r>
+              <w:rPr>
+                <w:rFonts w:ascii="Arial" w:cs="Arial" w:eastAsia="Arial" w:hAnsi="Arial"/>
+                <w:b/>
+                <w:bCs/>
+                <w:sz w:val="17"/>
+                <w:szCs w:val="17"/>
+              </w:rPr>
+              <w:t xml:space="preserve">9. Orden</w:t>
             </w:r>
           </w:p>
         </w:tc>

</xml_diff>